<commit_message>
Acordo com o preço de lançamento de 999 MT/mês para a empresa inteira
Co-Authored-By: Claude Opus 5.5 <noreply@anthropic.com>
Claude-Session: https://claude.ai/code/session_01Vuo8nn8g7uDFargv9U1qmC
</commit_message>
<xml_diff>
--- a/vendas/lancamento/Acordo-Facitrack.docx
+++ b/vendas/lancamento/Acordo-Facitrack.docx
@@ -172,7 +172,7 @@
           <w:sz w:val="20"/>
           <w:szCs w:val="20"/>
         </w:rPr>
-        <w:t xml:space="preserve">Acesso à plataforma Facitrack (manutenções, limpezas, água e combustível, fumigações, incidentes, contratos, alertas e relatórios), conforme o plano escolhido, com utilizadores ilimitados.</w:t>
+        <w:t xml:space="preserve">Acesso a todos os módulos da plataforma Facitrack (manutenções, limpezas, água e combustível com controlo do gerador, fumigações, incidentes, contratos e orçamento, alertas e relatórios), para todas as instalações e utilizadores da empresa.</w:t>
       </w:r>
     </w:p>
     <w:p>
@@ -335,7 +335,7 @@
                 <w:sz w:val="19"/>
                 <w:szCs w:val="19"/>
               </w:rPr>
-              <w:t xml:space="preserve">Desconto de lançamento</w:t>
+              <w:t xml:space="preserve">Condição</w:t>
             </w:r>
           </w:p>
         </w:tc>
@@ -364,7 +364,7 @@
                 <w:sz w:val="19"/>
                 <w:szCs w:val="19"/>
               </w:rPr>
-              <w:t xml:space="preserve">________________</w:t>
+              <w:t xml:space="preserve">Lançamento: empresa inteira, instalações e utilizadores ilimitados</w:t>
             </w:r>
           </w:p>
         </w:tc>
@@ -391,7 +391,7 @@
                 <w:sz w:val="19"/>
                 <w:szCs w:val="19"/>
               </w:rPr>
-              <w:t xml:space="preserve">________________</w:t>
+              <w:t xml:space="preserve">999 MT</w:t>
             </w:r>
           </w:p>
         </w:tc>
@@ -418,7 +418,7 @@
                 <w:sz w:val="19"/>
                 <w:szCs w:val="19"/>
               </w:rPr>
-              <w:t xml:space="preserve">40% durante 12 meses</w:t>
+              <w:t xml:space="preserve">Preço fixo durante 12 meses</w:t>
             </w:r>
           </w:p>
         </w:tc>
@@ -488,7 +488,7 @@
           <w:sz w:val="20"/>
           <w:szCs w:val="20"/>
         </w:rPr>
-        <w:t xml:space="preserve">O desconto de lançamento mantém-se durante 12 meses a contar da data de início. Depois aplica-se o preço do plano em vigor, com aviso de 30 dias.</w:t>
+        <w:t xml:space="preserve">O preço de lançamento mantém-se durante 12 meses a contar da data de início. Depois pode ser revisto, com aviso de 30 dias; se o cliente não concordar, pode sair sem custos.</w:t>
       </w:r>
     </w:p>
     <w:p>

</xml_diff>